<commit_message>
UPDATE : Customer Journey table des matière
</commit_message>
<xml_diff>
--- a/docs/perturbations/j1/equipe-18-customer-journeyV2.docx
+++ b/docs/perturbations/j1/equipe-18-customer-journeyV2.docx
@@ -86,26 +86,6 @@
     </w:p>
     <w:p>
       <w:pPr>
-        <w:spacing w:before="113"/>
-        <w:jc w:val="center"/>
-      </w:pPr>
-      <w:r>
-        <w:rPr>
-          <w:i/>
-          <w:color w:val="475569"/>
-          <w:sz w:val="18"/>
-        </w:rPr>
-        <w:lastRenderedPageBreak/>
-        <w:t>Auteur : Mohamed Amine EL AFRIT · Licence CC BY-NC-SA 4.0</w:t>
-      </w:r>
-    </w:p>
-    <w:p>
-      <w:r>
-        <w:br w:type="page"/>
-      </w:r>
-    </w:p>
-    <w:p>
-      <w:pPr>
         <w:spacing w:before="283"/>
       </w:pPr>
       <w:r>
@@ -371,26 +351,686 @@
         <w:t>Table des matières</w:t>
       </w:r>
     </w:p>
-    <w:p>
-      <w:pPr>
-        <w:spacing w:before="283"/>
-      </w:pPr>
-      <w:r>
-        <w:fldChar w:fldCharType="begin"/>
-      </w:r>
-      <w:r>
-        <w:instrText>TOC \o "1-3" \h \z \u</w:instrText>
-      </w:r>
-      <w:r>
-        <w:fldChar w:fldCharType="separate"/>
-      </w:r>
-      <w:r>
-        <w:t>(Table des matières non générée, appuyez sur F9 dans Word)</w:t>
-      </w:r>
-      <w:r>
-        <w:fldChar w:fldCharType="end"/>
-      </w:r>
-    </w:p>
+    <w:sdt>
+      <w:sdtPr>
+        <w:rPr>
+          <w:lang w:val="fr-FR"/>
+        </w:rPr>
+        <w:id w:val="1900169194"/>
+        <w:docPartObj>
+          <w:docPartGallery w:val="Table of Contents"/>
+          <w:docPartUnique/>
+        </w:docPartObj>
+      </w:sdtPr>
+      <w:sdtEndPr>
+        <w:rPr>
+          <w:rFonts w:asciiTheme="minorHAnsi" w:eastAsiaTheme="minorEastAsia" w:hAnsiTheme="minorHAnsi" w:cstheme="minorBidi"/>
+          <w:color w:val="auto"/>
+          <w:sz w:val="22"/>
+          <w:szCs w:val="22"/>
+          <w:lang w:val="en-US"/>
+        </w:rPr>
+      </w:sdtEndPr>
+      <w:sdtContent>
+        <w:p>
+          <w:pPr>
+            <w:pStyle w:val="En-ttedetabledesmatires"/>
+          </w:pPr>
+          <w:r>
+            <w:rPr>
+              <w:lang w:val="fr-FR"/>
+            </w:rPr>
+            <w:t>Table des matières</w:t>
+          </w:r>
+        </w:p>
+        <w:p>
+          <w:pPr>
+            <w:pStyle w:val="TM1"/>
+            <w:tabs>
+              <w:tab w:val="right" w:leader="dot" w:pos="8630"/>
+            </w:tabs>
+            <w:rPr>
+              <w:noProof/>
+            </w:rPr>
+          </w:pPr>
+          <w:r>
+            <w:fldChar w:fldCharType="begin"/>
+          </w:r>
+          <w:r>
+            <w:instrText xml:space="preserve"> TOC \o "1-3" \h \z \u </w:instrText>
+          </w:r>
+          <w:r>
+            <w:fldChar w:fldCharType="separate"/>
+          </w:r>
+          <w:hyperlink w:anchor="_Toc233727384" w:history="1">
+            <w:r>
+              <w:rPr>
+                <w:rStyle w:val="Lienhypertexte"/>
+                <w:noProof/>
+              </w:rPr>
+              <w:t>1. Parcours Étudiant, Léa Martin (cible primaire)</w:t>
+            </w:r>
+            <w:r>
+              <w:rPr>
+                <w:noProof/>
+                <w:webHidden/>
+              </w:rPr>
+              <w:tab/>
+            </w:r>
+            <w:r>
+              <w:rPr>
+                <w:noProof/>
+                <w:webHidden/>
+              </w:rPr>
+              <w:fldChar w:fldCharType="begin"/>
+            </w:r>
+            <w:r>
+              <w:rPr>
+                <w:noProof/>
+                <w:webHidden/>
+              </w:rPr>
+              <w:instrText xml:space="preserve"> PAGEREF _Toc233727384 \h </w:instrText>
+            </w:r>
+            <w:r>
+              <w:rPr>
+                <w:noProof/>
+                <w:webHidden/>
+              </w:rPr>
+            </w:r>
+            <w:r>
+              <w:rPr>
+                <w:noProof/>
+                <w:webHidden/>
+              </w:rPr>
+              <w:fldChar w:fldCharType="separate"/>
+            </w:r>
+            <w:r>
+              <w:rPr>
+                <w:noProof/>
+                <w:webHidden/>
+              </w:rPr>
+              <w:t>4</w:t>
+            </w:r>
+            <w:r>
+              <w:rPr>
+                <w:noProof/>
+                <w:webHidden/>
+              </w:rPr>
+              <w:fldChar w:fldCharType="end"/>
+            </w:r>
+          </w:hyperlink>
+        </w:p>
+        <w:p>
+          <w:pPr>
+            <w:pStyle w:val="TM1"/>
+            <w:tabs>
+              <w:tab w:val="right" w:leader="dot" w:pos="8630"/>
+            </w:tabs>
+            <w:rPr>
+              <w:noProof/>
+            </w:rPr>
+          </w:pPr>
+          <w:hyperlink w:anchor="_Toc233727385" w:history="1">
+            <w:r>
+              <w:rPr>
+                <w:rStyle w:val="Lienhypertexte"/>
+                <w:noProof/>
+              </w:rPr>
+              <w:t>2. Parcours Enseignant, Mme Lefèvre (cible primaire)</w:t>
+            </w:r>
+            <w:r>
+              <w:rPr>
+                <w:noProof/>
+                <w:webHidden/>
+              </w:rPr>
+              <w:tab/>
+            </w:r>
+            <w:r>
+              <w:rPr>
+                <w:noProof/>
+                <w:webHidden/>
+              </w:rPr>
+              <w:fldChar w:fldCharType="begin"/>
+            </w:r>
+            <w:r>
+              <w:rPr>
+                <w:noProof/>
+                <w:webHidden/>
+              </w:rPr>
+              <w:instrText xml:space="preserve"> PAGEREF _Toc233727385 \h </w:instrText>
+            </w:r>
+            <w:r>
+              <w:rPr>
+                <w:noProof/>
+                <w:webHidden/>
+              </w:rPr>
+            </w:r>
+            <w:r>
+              <w:rPr>
+                <w:noProof/>
+                <w:webHidden/>
+              </w:rPr>
+              <w:fldChar w:fldCharType="separate"/>
+            </w:r>
+            <w:r>
+              <w:rPr>
+                <w:noProof/>
+                <w:webHidden/>
+              </w:rPr>
+              <w:t>5</w:t>
+            </w:r>
+            <w:r>
+              <w:rPr>
+                <w:noProof/>
+                <w:webHidden/>
+              </w:rPr>
+              <w:fldChar w:fldCharType="end"/>
+            </w:r>
+          </w:hyperlink>
+        </w:p>
+        <w:p>
+          <w:pPr>
+            <w:pStyle w:val="TM1"/>
+            <w:tabs>
+              <w:tab w:val="right" w:leader="dot" w:pos="8630"/>
+            </w:tabs>
+            <w:rPr>
+              <w:noProof/>
+            </w:rPr>
+          </w:pPr>
+          <w:hyperlink w:anchor="_Toc233727386" w:history="1">
+            <w:r>
+              <w:rPr>
+                <w:rStyle w:val="Lienhypertexte"/>
+                <w:noProof/>
+              </w:rPr>
+              <w:t>3. Parcours Établissement, M. David Chen (cible tertiaire B2B)</w:t>
+            </w:r>
+            <w:r>
+              <w:rPr>
+                <w:noProof/>
+                <w:webHidden/>
+              </w:rPr>
+              <w:tab/>
+            </w:r>
+            <w:r>
+              <w:rPr>
+                <w:noProof/>
+                <w:webHidden/>
+              </w:rPr>
+              <w:fldChar w:fldCharType="begin"/>
+            </w:r>
+            <w:r>
+              <w:rPr>
+                <w:noProof/>
+                <w:webHidden/>
+              </w:rPr>
+              <w:instrText xml:space="preserve"> PAGEREF _Toc233727386 \h </w:instrText>
+            </w:r>
+            <w:r>
+              <w:rPr>
+                <w:noProof/>
+                <w:webHidden/>
+              </w:rPr>
+            </w:r>
+            <w:r>
+              <w:rPr>
+                <w:noProof/>
+                <w:webHidden/>
+              </w:rPr>
+              <w:fldChar w:fldCharType="separate"/>
+            </w:r>
+            <w:r>
+              <w:rPr>
+                <w:noProof/>
+                <w:webHidden/>
+              </w:rPr>
+              <w:t>7</w:t>
+            </w:r>
+            <w:r>
+              <w:rPr>
+                <w:noProof/>
+                <w:webHidden/>
+              </w:rPr>
+              <w:fldChar w:fldCharType="end"/>
+            </w:r>
+          </w:hyperlink>
+        </w:p>
+        <w:p>
+          <w:pPr>
+            <w:pStyle w:val="TM1"/>
+            <w:tabs>
+              <w:tab w:val="right" w:leader="dot" w:pos="8630"/>
+            </w:tabs>
+            <w:rPr>
+              <w:noProof/>
+            </w:rPr>
+          </w:pPr>
+          <w:hyperlink w:anchor="_Toc233727387" w:history="1">
+            <w:r>
+              <w:rPr>
+                <w:rStyle w:val="Lienhypertexte"/>
+                <w:noProof/>
+              </w:rPr>
+              <w:t>4. Synthèse émotionnelle des 3 parcours</w:t>
+            </w:r>
+            <w:r>
+              <w:rPr>
+                <w:noProof/>
+                <w:webHidden/>
+              </w:rPr>
+              <w:tab/>
+            </w:r>
+            <w:r>
+              <w:rPr>
+                <w:noProof/>
+                <w:webHidden/>
+              </w:rPr>
+              <w:fldChar w:fldCharType="begin"/>
+            </w:r>
+            <w:r>
+              <w:rPr>
+                <w:noProof/>
+                <w:webHidden/>
+              </w:rPr>
+              <w:instrText xml:space="preserve"> PAGEREF _Toc233727387 \h </w:instrText>
+            </w:r>
+            <w:r>
+              <w:rPr>
+                <w:noProof/>
+                <w:webHidden/>
+              </w:rPr>
+            </w:r>
+            <w:r>
+              <w:rPr>
+                <w:noProof/>
+                <w:webHidden/>
+              </w:rPr>
+              <w:fldChar w:fldCharType="separate"/>
+            </w:r>
+            <w:r>
+              <w:rPr>
+                <w:noProof/>
+                <w:webHidden/>
+              </w:rPr>
+              <w:t>8</w:t>
+            </w:r>
+            <w:r>
+              <w:rPr>
+                <w:noProof/>
+                <w:webHidden/>
+              </w:rPr>
+              <w:fldChar w:fldCharType="end"/>
+            </w:r>
+          </w:hyperlink>
+        </w:p>
+        <w:p>
+          <w:pPr>
+            <w:pStyle w:val="TM1"/>
+            <w:tabs>
+              <w:tab w:val="right" w:leader="dot" w:pos="8630"/>
+            </w:tabs>
+            <w:rPr>
+              <w:noProof/>
+            </w:rPr>
+          </w:pPr>
+          <w:hyperlink w:anchor="_Toc233727388" w:history="1">
+            <w:r>
+              <w:rPr>
+                <w:rStyle w:val="Lienhypertexte"/>
+                <w:rFonts w:ascii="Segoe UI Emoji" w:hAnsi="Segoe UI Emoji" w:cs="Segoe UI Emoji"/>
+                <w:noProof/>
+              </w:rPr>
+              <w:t>✅</w:t>
+            </w:r>
+            <w:r>
+              <w:rPr>
+                <w:rStyle w:val="Lienhypertexte"/>
+                <w:noProof/>
+              </w:rPr>
+              <w:t xml:space="preserve"> Grille d'auto-évaluation</w:t>
+            </w:r>
+            <w:r>
+              <w:rPr>
+                <w:noProof/>
+                <w:webHidden/>
+              </w:rPr>
+              <w:tab/>
+            </w:r>
+            <w:r>
+              <w:rPr>
+                <w:noProof/>
+                <w:webHidden/>
+              </w:rPr>
+              <w:fldChar w:fldCharType="begin"/>
+            </w:r>
+            <w:r>
+              <w:rPr>
+                <w:noProof/>
+                <w:webHidden/>
+              </w:rPr>
+              <w:instrText xml:space="preserve"> PAGEREF _Toc233727388 \h </w:instrText>
+            </w:r>
+            <w:r>
+              <w:rPr>
+                <w:noProof/>
+                <w:webHidden/>
+              </w:rPr>
+            </w:r>
+            <w:r>
+              <w:rPr>
+                <w:noProof/>
+                <w:webHidden/>
+              </w:rPr>
+              <w:fldChar w:fldCharType="separate"/>
+            </w:r>
+            <w:r>
+              <w:rPr>
+                <w:noProof/>
+                <w:webHidden/>
+              </w:rPr>
+              <w:t>9</w:t>
+            </w:r>
+            <w:r>
+              <w:rPr>
+                <w:noProof/>
+                <w:webHidden/>
+              </w:rPr>
+              <w:fldChar w:fldCharType="end"/>
+            </w:r>
+          </w:hyperlink>
+        </w:p>
+        <w:p>
+          <w:pPr>
+            <w:pStyle w:val="TM1"/>
+            <w:tabs>
+              <w:tab w:val="right" w:leader="dot" w:pos="8630"/>
+            </w:tabs>
+            <w:rPr>
+              <w:noProof/>
+            </w:rPr>
+          </w:pPr>
+          <w:hyperlink w:anchor="_Toc233727389" w:history="1">
+            <w:r>
+              <w:rPr>
+                <w:rStyle w:val="Lienhypertexte"/>
+                <w:rFonts w:ascii="Segoe UI Emoji" w:hAnsi="Segoe UI Emoji" w:cs="Segoe UI Emoji"/>
+                <w:noProof/>
+              </w:rPr>
+              <w:t>📚</w:t>
+            </w:r>
+            <w:r>
+              <w:rPr>
+                <w:rStyle w:val="Lienhypertexte"/>
+                <w:noProof/>
+              </w:rPr>
+              <w:t xml:space="preserve"> Références et conventions</w:t>
+            </w:r>
+            <w:r>
+              <w:rPr>
+                <w:noProof/>
+                <w:webHidden/>
+              </w:rPr>
+              <w:tab/>
+            </w:r>
+            <w:r>
+              <w:rPr>
+                <w:noProof/>
+                <w:webHidden/>
+              </w:rPr>
+              <w:fldChar w:fldCharType="begin"/>
+            </w:r>
+            <w:r>
+              <w:rPr>
+                <w:noProof/>
+                <w:webHidden/>
+              </w:rPr>
+              <w:instrText xml:space="preserve"> PAGEREF _Toc233727389 \h </w:instrText>
+            </w:r>
+            <w:r>
+              <w:rPr>
+                <w:noProof/>
+                <w:webHidden/>
+              </w:rPr>
+            </w:r>
+            <w:r>
+              <w:rPr>
+                <w:noProof/>
+                <w:webHidden/>
+              </w:rPr>
+              <w:fldChar w:fldCharType="separate"/>
+            </w:r>
+            <w:r>
+              <w:rPr>
+                <w:noProof/>
+                <w:webHidden/>
+              </w:rPr>
+              <w:t>10</w:t>
+            </w:r>
+            <w:r>
+              <w:rPr>
+                <w:noProof/>
+                <w:webHidden/>
+              </w:rPr>
+              <w:fldChar w:fldCharType="end"/>
+            </w:r>
+          </w:hyperlink>
+        </w:p>
+        <w:p>
+          <w:pPr>
+            <w:pStyle w:val="TM2"/>
+            <w:tabs>
+              <w:tab w:val="right" w:leader="dot" w:pos="8630"/>
+            </w:tabs>
+            <w:rPr>
+              <w:noProof/>
+            </w:rPr>
+          </w:pPr>
+          <w:hyperlink w:anchor="_Toc233727390" w:history="1">
+            <w:r>
+              <w:rPr>
+                <w:rStyle w:val="Lienhypertexte"/>
+                <w:noProof/>
+              </w:rPr>
+              <w:t>Références incontournables</w:t>
+            </w:r>
+            <w:r>
+              <w:rPr>
+                <w:noProof/>
+                <w:webHidden/>
+              </w:rPr>
+              <w:tab/>
+            </w:r>
+            <w:r>
+              <w:rPr>
+                <w:noProof/>
+                <w:webHidden/>
+              </w:rPr>
+              <w:fldChar w:fldCharType="begin"/>
+            </w:r>
+            <w:r>
+              <w:rPr>
+                <w:noProof/>
+                <w:webHidden/>
+              </w:rPr>
+              <w:instrText xml:space="preserve"> PAGEREF _Toc233727390 \h </w:instrText>
+            </w:r>
+            <w:r>
+              <w:rPr>
+                <w:noProof/>
+                <w:webHidden/>
+              </w:rPr>
+            </w:r>
+            <w:r>
+              <w:rPr>
+                <w:noProof/>
+                <w:webHidden/>
+              </w:rPr>
+              <w:fldChar w:fldCharType="separate"/>
+            </w:r>
+            <w:r>
+              <w:rPr>
+                <w:noProof/>
+                <w:webHidden/>
+              </w:rPr>
+              <w:t>10</w:t>
+            </w:r>
+            <w:r>
+              <w:rPr>
+                <w:noProof/>
+                <w:webHidden/>
+              </w:rPr>
+              <w:fldChar w:fldCharType="end"/>
+            </w:r>
+          </w:hyperlink>
+        </w:p>
+        <w:p>
+          <w:pPr>
+            <w:pStyle w:val="TM2"/>
+            <w:tabs>
+              <w:tab w:val="right" w:leader="dot" w:pos="8630"/>
+            </w:tabs>
+            <w:rPr>
+              <w:noProof/>
+            </w:rPr>
+          </w:pPr>
+          <w:hyperlink w:anchor="_Toc233727391" w:history="1">
+            <w:r>
+              <w:rPr>
+                <w:rStyle w:val="Lienhypertexte"/>
+                <w:noProof/>
+              </w:rPr>
+              <w:t>Références spécifiques à ce document</w:t>
+            </w:r>
+            <w:r>
+              <w:rPr>
+                <w:noProof/>
+                <w:webHidden/>
+              </w:rPr>
+              <w:tab/>
+            </w:r>
+            <w:r>
+              <w:rPr>
+                <w:noProof/>
+                <w:webHidden/>
+              </w:rPr>
+              <w:fldChar w:fldCharType="begin"/>
+            </w:r>
+            <w:r>
+              <w:rPr>
+                <w:noProof/>
+                <w:webHidden/>
+              </w:rPr>
+              <w:instrText xml:space="preserve"> PAGEREF _Toc233727391 \h </w:instrText>
+            </w:r>
+            <w:r>
+              <w:rPr>
+                <w:noProof/>
+                <w:webHidden/>
+              </w:rPr>
+            </w:r>
+            <w:r>
+              <w:rPr>
+                <w:noProof/>
+                <w:webHidden/>
+              </w:rPr>
+              <w:fldChar w:fldCharType="separate"/>
+            </w:r>
+            <w:r>
+              <w:rPr>
+                <w:noProof/>
+                <w:webHidden/>
+              </w:rPr>
+              <w:t>10</w:t>
+            </w:r>
+            <w:r>
+              <w:rPr>
+                <w:noProof/>
+                <w:webHidden/>
+              </w:rPr>
+              <w:fldChar w:fldCharType="end"/>
+            </w:r>
+          </w:hyperlink>
+        </w:p>
+        <w:p>
+          <w:pPr>
+            <w:pStyle w:val="TM2"/>
+            <w:tabs>
+              <w:tab w:val="right" w:leader="dot" w:pos="8630"/>
+            </w:tabs>
+            <w:rPr>
+              <w:noProof/>
+            </w:rPr>
+          </w:pPr>
+          <w:hyperlink w:anchor="_Toc233727392" w:history="1">
+            <w:r>
+              <w:rPr>
+                <w:rStyle w:val="Lienhypertexte"/>
+                <w:noProof/>
+              </w:rPr>
+              <w:t>Convention de versionnement</w:t>
+            </w:r>
+            <w:r>
+              <w:rPr>
+                <w:noProof/>
+                <w:webHidden/>
+              </w:rPr>
+              <w:tab/>
+            </w:r>
+            <w:r>
+              <w:rPr>
+                <w:noProof/>
+                <w:webHidden/>
+              </w:rPr>
+              <w:fldChar w:fldCharType="begin"/>
+            </w:r>
+            <w:r>
+              <w:rPr>
+                <w:noProof/>
+                <w:webHidden/>
+              </w:rPr>
+              <w:instrText xml:space="preserve"> PAGEREF _Toc233727392 \h </w:instrText>
+            </w:r>
+            <w:r>
+              <w:rPr>
+                <w:noProof/>
+                <w:webHidden/>
+              </w:rPr>
+            </w:r>
+            <w:r>
+              <w:rPr>
+                <w:noProof/>
+                <w:webHidden/>
+              </w:rPr>
+              <w:fldChar w:fldCharType="separate"/>
+            </w:r>
+            <w:r>
+              <w:rPr>
+                <w:noProof/>
+                <w:webHidden/>
+              </w:rPr>
+              <w:t>10</w:t>
+            </w:r>
+            <w:r>
+              <w:rPr>
+                <w:noProof/>
+                <w:webHidden/>
+              </w:rPr>
+              <w:fldChar w:fldCharType="end"/>
+            </w:r>
+          </w:hyperlink>
+        </w:p>
+        <w:p>
+          <w:r>
+            <w:rPr>
+              <w:b/>
+              <w:bCs/>
+            </w:rPr>
+            <w:fldChar w:fldCharType="end"/>
+          </w:r>
+        </w:p>
+      </w:sdtContent>
+    </w:sdt>
     <w:p>
       <w:r>
         <w:br w:type="page"/>
@@ -400,6 +1040,7 @@
       <w:pPr>
         <w:pStyle w:val="Titre1"/>
       </w:pPr>
+      <w:bookmarkStart w:id="0" w:name="_Toc233727384"/>
       <w:r>
         <w:rPr>
           <w:color w:val="1E1B4B"/>
@@ -407,6 +1048,7 @@
         <w:lastRenderedPageBreak/>
         <w:t>1. Parcours Étudiant, Léa Martin (cible primaire)</w:t>
       </w:r>
+      <w:bookmarkEnd w:id="0"/>
     </w:p>
     <w:p>
       <w:pPr>
@@ -806,7 +1448,6 @@
           </w:tcPr>
           <w:p>
             <w:r>
-              <w:lastRenderedPageBreak/>
               <w:t>5. Recommandation</w:t>
             </w:r>
           </w:p>
@@ -883,12 +1524,14 @@
       <w:pPr>
         <w:pStyle w:val="Titre1"/>
       </w:pPr>
+      <w:bookmarkStart w:id="1" w:name="_Toc233727385"/>
       <w:r>
         <w:rPr>
           <w:color w:val="1E1B4B"/>
         </w:rPr>
         <w:t>2. Parcours Enseignant, Mme Lefèvre (cible primaire)</w:t>
       </w:r>
+      <w:bookmarkEnd w:id="1"/>
     </w:p>
     <w:tbl>
       <w:tblPr>
@@ -1220,7 +1863,6 @@
           </w:tcPr>
           <w:p>
             <w:r>
-              <w:lastRenderedPageBreak/>
               <w:t>4. Usage régulier</w:t>
             </w:r>
           </w:p>
@@ -1366,12 +2008,14 @@
       <w:pPr>
         <w:pStyle w:val="Titre1"/>
       </w:pPr>
+      <w:bookmarkStart w:id="2" w:name="_Toc233727386"/>
       <w:r>
         <w:rPr>
           <w:color w:val="1E1B4B"/>
         </w:rPr>
         <w:t>3. Parcours Établissement, M. David Chen (cible tertiaire B2B)</w:t>
       </w:r>
+      <w:bookmarkEnd w:id="2"/>
     </w:p>
     <w:tbl>
       <w:tblPr>
@@ -1834,7 +2478,6 @@
         <w:rPr>
           <w:b/>
         </w:rPr>
-        <w:lastRenderedPageBreak/>
         <w:t xml:space="preserve">Moment de décrochage potentiel identifié : </w:t>
       </w:r>
       <w:r>
@@ -1848,12 +2491,14 @@
       <w:pPr>
         <w:pStyle w:val="Titre1"/>
       </w:pPr>
+      <w:bookmarkStart w:id="3" w:name="_Toc233727387"/>
       <w:r>
         <w:rPr>
           <w:color w:val="1E1B4B"/>
         </w:rPr>
         <w:t>4. Synthèse émotionnelle des 3 parcours</w:t>
       </w:r>
+      <w:bookmarkEnd w:id="3"/>
     </w:p>
     <w:tbl>
       <w:tblPr>
@@ -2237,6 +2882,7 @@
       <w:pPr>
         <w:pStyle w:val="Titre1"/>
       </w:pPr>
+      <w:bookmarkStart w:id="4" w:name="_Toc233727388"/>
       <w:r>
         <w:rPr>
           <w:color w:val="1E1B4B"/>
@@ -2244,6 +2890,7 @@
         <w:lastRenderedPageBreak/>
         <w:t>✅ Grille d'auto-évaluation</w:t>
       </w:r>
+      <w:bookmarkEnd w:id="4"/>
     </w:p>
     <w:p>
       <w:r>
@@ -2735,6 +3382,7 @@
       <w:pPr>
         <w:pStyle w:val="Titre1"/>
       </w:pPr>
+      <w:bookmarkStart w:id="5" w:name="_Toc233727389"/>
       <w:r>
         <w:rPr>
           <w:color w:val="1E1B4B"/>
@@ -2742,17 +3390,20 @@
         <w:lastRenderedPageBreak/>
         <w:t>📚 Références et conventions</w:t>
       </w:r>
+      <w:bookmarkEnd w:id="5"/>
     </w:p>
     <w:p>
       <w:pPr>
         <w:pStyle w:val="Titre2"/>
       </w:pPr>
+      <w:bookmarkStart w:id="6" w:name="_Toc233727390"/>
       <w:r>
         <w:rPr>
           <w:color w:val="1E1B4B"/>
         </w:rPr>
         <w:t>Références incontournables</w:t>
       </w:r>
+      <w:bookmarkEnd w:id="6"/>
     </w:p>
     <w:p>
       <w:r>
@@ -2791,12 +3442,14 @@
       <w:pPr>
         <w:pStyle w:val="Titre2"/>
       </w:pPr>
+      <w:bookmarkStart w:id="7" w:name="_Toc233727391"/>
       <w:r>
         <w:rPr>
           <w:color w:val="1E1B4B"/>
         </w:rPr>
         <w:t>Références spécifiques à ce document</w:t>
       </w:r>
+      <w:bookmarkEnd w:id="7"/>
     </w:p>
     <w:p>
       <w:r>
@@ -2846,12 +3499,14 @@
       <w:pPr>
         <w:pStyle w:val="Titre2"/>
       </w:pPr>
+      <w:bookmarkStart w:id="8" w:name="_Toc233727392"/>
       <w:r>
         <w:rPr>
           <w:color w:val="1E1B4B"/>
         </w:rPr>
         <w:t>Convention de versionnement</w:t>
       </w:r>
+      <w:bookmarkEnd w:id="8"/>
     </w:p>
     <w:p>
       <w:pPr>
@@ -4493,7 +5148,6 @@
     <w:basedOn w:val="Titre1"/>
     <w:next w:val="Normal"/>
     <w:uiPriority w:val="39"/>
-    <w:semiHidden/>
     <w:unhideWhenUsed/>
     <w:qFormat/>
     <w:rsid w:val="00FC693F"/>
@@ -14554,6 +15208,42 @@
         <w:shd w:val="clear" w:color="auto" w:fill="FBCAA2" w:themeFill="accent6" w:themeFillTint="7F"/>
       </w:tcPr>
     </w:tblStylePr>
+  </w:style>
+  <w:style w:type="paragraph" w:styleId="TM1">
+    <w:name w:val="toc 1"/>
+    <w:basedOn w:val="Normal"/>
+    <w:next w:val="Normal"/>
+    <w:autoRedefine/>
+    <w:uiPriority w:val="39"/>
+    <w:unhideWhenUsed/>
+    <w:rsid w:val="002317B3"/>
+    <w:pPr>
+      <w:spacing w:after="100"/>
+    </w:pPr>
+  </w:style>
+  <w:style w:type="paragraph" w:styleId="TM2">
+    <w:name w:val="toc 2"/>
+    <w:basedOn w:val="Normal"/>
+    <w:next w:val="Normal"/>
+    <w:autoRedefine/>
+    <w:uiPriority w:val="39"/>
+    <w:unhideWhenUsed/>
+    <w:rsid w:val="002317B3"/>
+    <w:pPr>
+      <w:spacing w:after="100"/>
+      <w:ind w:left="220"/>
+    </w:pPr>
+  </w:style>
+  <w:style w:type="character" w:styleId="Lienhypertexte">
+    <w:name w:val="Hyperlink"/>
+    <w:basedOn w:val="Policepardfaut"/>
+    <w:uiPriority w:val="99"/>
+    <w:unhideWhenUsed/>
+    <w:rsid w:val="002317B3"/>
+    <w:rPr>
+      <w:color w:val="0000FF" w:themeColor="hyperlink"/>
+      <w:u w:val="single"/>
+    </w:rPr>
   </w:style>
 </w:styles>
 </file>

</xml_diff>